<commit_message>
P3-Lun 27 de abril
</commit_message>
<xml_diff>
--- a/Paola Griselda/P3/IA_II_Notas Tercer Parcial 1.docx
+++ b/Paola Griselda/P3/IA_II_Notas Tercer Parcial 1.docx
@@ -740,6 +740,7 @@
       </w:pPr>
       <w:r>
         <w:rPr>
+          <w:noProof/>
           <w:lang w:val="es-ES"/>
         </w:rPr>
         <w:drawing>
@@ -931,6 +932,7 @@
       </w:pPr>
       <w:r>
         <w:rPr>
+          <w:noProof/>
           <w:lang w:val="es-ES"/>
         </w:rPr>
         <w:drawing>
@@ -1209,6 +1211,7 @@
       </w:pPr>
       <w:r>
         <w:rPr>
+          <w:noProof/>
           <w:lang w:val="es-ES"/>
         </w:rPr>
         <w:drawing>
@@ -1285,6 +1288,7 @@
       </w:pPr>
       <w:r>
         <w:rPr>
+          <w:noProof/>
           <w:lang w:val="es-ES"/>
         </w:rPr>
         <w:lastRenderedPageBreak/>
@@ -1398,6 +1402,7 @@
       </w:pPr>
       <w:r>
         <w:rPr>
+          <w:noProof/>
           <w:lang w:val="es-ES"/>
         </w:rPr>
         <w:drawing>
@@ -1444,8 +1449,465 @@
           <w:lang w:val="es-ES"/>
         </w:rPr>
       </w:pPr>
+    </w:p>
+    <w:p>
+      <w:pPr>
+        <w:ind w:left="708" w:hanging="708"/>
+        <w:rPr>
+          <w:lang w:val="es-ES"/>
+        </w:rPr>
+      </w:pPr>
+      <w:r>
+        <w:rPr>
+          <w:lang w:val="es-ES"/>
+        </w:rPr>
+        <w:t xml:space="preserve">Lunes 27 de </w:t>
+      </w:r>
+      <w:proofErr w:type="gramStart"/>
+      <w:r>
+        <w:rPr>
+          <w:lang w:val="es-ES"/>
+        </w:rPr>
+        <w:t>Abril</w:t>
+      </w:r>
+      <w:proofErr w:type="gramEnd"/>
+    </w:p>
+    <w:p>
+      <w:pPr>
+        <w:ind w:left="708" w:hanging="708"/>
+        <w:rPr>
+          <w:lang w:val="es-ES"/>
+        </w:rPr>
+      </w:pPr>
+    </w:p>
+    <w:p>
+      <w:pPr>
+        <w:ind w:left="708" w:hanging="708"/>
+        <w:rPr>
+          <w:lang w:val="es-ES"/>
+        </w:rPr>
+      </w:pPr>
+      <w:r>
+        <w:rPr>
+          <w:lang w:val="es-ES"/>
+        </w:rPr>
+        <w:t>Archivo de pruebas formales</w:t>
+      </w:r>
+    </w:p>
+    <w:p>
+      <w:pPr>
+        <w:ind w:left="708" w:hanging="708"/>
+        <w:rPr>
+          <w:lang w:val="es-ES"/>
+        </w:rPr>
+      </w:pPr>
+      <w:hyperlink r:id="rId12" w:history="1">
+        <w:r>
+          <w:rPr>
+            <w:rStyle w:val="Hipervnculo"/>
+            <w:lang w:val="es-ES"/>
+          </w:rPr>
+          <w:t>https://www.isa-afp.org/</w:t>
+        </w:r>
+      </w:hyperlink>
+      <w:r>
+        <w:rPr>
+          <w:lang w:val="es-ES"/>
+        </w:rPr>
+        <w:t xml:space="preserve"> </w:t>
+      </w:r>
+    </w:p>
+    <w:p>
+      <w:pPr>
+        <w:ind w:left="708" w:hanging="708"/>
+        <w:rPr>
+          <w:lang w:val="es-ES"/>
+        </w:rPr>
+      </w:pPr>
+      <w:r>
+        <w:rPr>
+          <w:lang w:val="es-ES"/>
+        </w:rPr>
+        <w:t xml:space="preserve">para hacer las demostraciones sutilizamos </w:t>
+      </w:r>
+      <w:proofErr w:type="spellStart"/>
+      <w:r>
+        <w:rPr>
+          <w:lang w:val="es-ES"/>
+        </w:rPr>
+        <w:t>apply</w:t>
+      </w:r>
+      <w:proofErr w:type="spellEnd"/>
+      <w:r>
+        <w:rPr>
+          <w:lang w:val="es-ES"/>
+        </w:rPr>
+        <w:t>(</w:t>
+      </w:r>
+      <w:proofErr w:type="spellStart"/>
+      <w:r>
+        <w:rPr>
+          <w:lang w:val="es-ES"/>
+        </w:rPr>
+        <w:t>induction</w:t>
+      </w:r>
+      <w:proofErr w:type="spellEnd"/>
+      <w:r>
+        <w:rPr>
+          <w:lang w:val="es-ES"/>
+        </w:rPr>
+        <w:t xml:space="preserve">), el </w:t>
+      </w:r>
+    </w:p>
+    <w:p>
+      <w:pPr>
+        <w:ind w:left="708" w:hanging="708"/>
+        <w:rPr>
+          <w:lang w:val="es-ES"/>
+        </w:rPr>
+      </w:pPr>
+      <w:proofErr w:type="spellStart"/>
+      <w:r>
+        <w:rPr>
+          <w:lang w:val="es-ES"/>
+        </w:rPr>
+        <w:t>apply</w:t>
+      </w:r>
+      <w:proofErr w:type="spellEnd"/>
+      <w:r>
+        <w:rPr>
+          <w:lang w:val="es-ES"/>
+        </w:rPr>
+        <w:t xml:space="preserve"> es similar a </w:t>
+      </w:r>
+    </w:p>
+    <w:p>
+      <w:pPr>
+        <w:ind w:left="708" w:hanging="708"/>
+        <w:rPr>
+          <w:lang w:val="es-ES"/>
+        </w:rPr>
+      </w:pPr>
+      <w:r>
+        <w:rPr>
+          <w:lang w:val="es-ES"/>
+        </w:rPr>
+        <w:t xml:space="preserve">asume *formula*, </w:t>
+      </w:r>
+      <w:proofErr w:type="spellStart"/>
+      <w:r>
+        <w:rPr>
+          <w:lang w:val="es-ES"/>
+        </w:rPr>
+        <w:t>have</w:t>
+      </w:r>
+      <w:proofErr w:type="spellEnd"/>
+      <w:r>
+        <w:rPr>
+          <w:lang w:val="es-ES"/>
+        </w:rPr>
+        <w:t xml:space="preserve"> *formula* </w:t>
+      </w:r>
+      <w:proofErr w:type="spellStart"/>
+      <w:r>
+        <w:rPr>
+          <w:lang w:val="es-ES"/>
+        </w:rPr>
+        <w:t>by</w:t>
+      </w:r>
+      <w:proofErr w:type="spellEnd"/>
+      <w:r>
+        <w:rPr>
+          <w:lang w:val="es-ES"/>
+        </w:rPr>
+        <w:t xml:space="preserve"> *método*</w:t>
+      </w:r>
+    </w:p>
+    <w:p>
+      <w:pPr>
+        <w:ind w:left="708" w:hanging="708"/>
+        <w:rPr>
+          <w:lang w:val="es-ES"/>
+        </w:rPr>
+      </w:pPr>
+      <w:r>
+        <w:rPr>
+          <w:lang w:val="es-ES"/>
+        </w:rPr>
+        <w:drawing>
+          <wp:inline distT="0" distB="0" distL="0" distR="0" wp14:anchorId="7DF413EB" wp14:editId="1A1EB3FB">
+            <wp:extent cx="3581400" cy="2367798"/>
+            <wp:effectExtent l="0" t="0" r="0" b="0"/>
+            <wp:docPr id="7" name="Imagen 7"/>
+            <wp:cNvGraphicFramePr>
+              <a:graphicFrameLocks xmlns:a="http://schemas.openxmlformats.org/drawingml/2006/main" noChangeAspect="1"/>
+            </wp:cNvGraphicFramePr>
+            <a:graphic xmlns:a="http://schemas.openxmlformats.org/drawingml/2006/main">
+              <a:graphicData uri="http://schemas.openxmlformats.org/drawingml/2006/picture">
+                <pic:pic xmlns:pic="http://schemas.openxmlformats.org/drawingml/2006/picture">
+                  <pic:nvPicPr>
+                    <pic:cNvPr id="1" name=""/>
+                    <pic:cNvPicPr/>
+                  </pic:nvPicPr>
+                  <pic:blipFill>
+                    <a:blip r:embed="rId13"/>
+                    <a:stretch>
+                      <a:fillRect/>
+                    </a:stretch>
+                  </pic:blipFill>
+                  <pic:spPr>
+                    <a:xfrm>
+                      <a:off x="0" y="0"/>
+                      <a:ext cx="3586108" cy="2370911"/>
+                    </a:xfrm>
+                    <a:prstGeom prst="rect">
+                      <a:avLst/>
+                    </a:prstGeom>
+                  </pic:spPr>
+                </pic:pic>
+              </a:graphicData>
+            </a:graphic>
+          </wp:inline>
+        </w:drawing>
+      </w:r>
+    </w:p>
+    <w:p>
+      <w:pPr>
+        <w:ind w:left="708" w:hanging="708"/>
+        <w:rPr>
+          <w:lang w:val="es-ES"/>
+        </w:rPr>
+      </w:pPr>
+    </w:p>
+    <w:p>
+      <w:pPr>
+        <w:ind w:left="708" w:hanging="708"/>
+        <w:rPr>
+          <w:lang w:val="es-ES"/>
+        </w:rPr>
+      </w:pPr>
+      <w:r>
+        <w:rPr>
+          <w:lang w:val="es-ES"/>
+        </w:rPr>
+        <w:t xml:space="preserve">Este </w:t>
+      </w:r>
+      <w:r>
+        <w:rPr>
+          <w:lang w:val="es-ES"/>
+        </w:rPr>
+        <w:t>patrón es lo que demuestra lo siguiente:</w:t>
+      </w:r>
+    </w:p>
+    <w:p>
+      <w:pPr>
+        <w:ind w:left="708" w:hanging="708"/>
+        <w:rPr>
+          <w:lang w:val="es-ES"/>
+        </w:rPr>
+      </w:pPr>
+      <w:r>
+        <w:rPr>
+          <w:lang w:val="es-ES"/>
+        </w:rPr>
+        <w:drawing>
+          <wp:inline distT="0" distB="0" distL="0" distR="0" wp14:anchorId="3AD6AD71" wp14:editId="25DA63C6">
+            <wp:extent cx="4020111" cy="457264"/>
+            <wp:effectExtent l="0" t="0" r="0" b="0"/>
+            <wp:docPr id="10" name="Imagen 10"/>
+            <wp:cNvGraphicFramePr>
+              <a:graphicFrameLocks xmlns:a="http://schemas.openxmlformats.org/drawingml/2006/main" noChangeAspect="1"/>
+            </wp:cNvGraphicFramePr>
+            <a:graphic xmlns:a="http://schemas.openxmlformats.org/drawingml/2006/main">
+              <a:graphicData uri="http://schemas.openxmlformats.org/drawingml/2006/picture">
+                <pic:pic xmlns:pic="http://schemas.openxmlformats.org/drawingml/2006/picture">
+                  <pic:nvPicPr>
+                    <pic:cNvPr id="1" name=""/>
+                    <pic:cNvPicPr/>
+                  </pic:nvPicPr>
+                  <pic:blipFill>
+                    <a:blip r:embed="rId14"/>
+                    <a:stretch>
+                      <a:fillRect/>
+                    </a:stretch>
+                  </pic:blipFill>
+                  <pic:spPr>
+                    <a:xfrm>
+                      <a:off x="0" y="0"/>
+                      <a:ext cx="4020111" cy="457264"/>
+                    </a:xfrm>
+                    <a:prstGeom prst="rect">
+                      <a:avLst/>
+                    </a:prstGeom>
+                  </pic:spPr>
+                </pic:pic>
+              </a:graphicData>
+            </a:graphic>
+          </wp:inline>
+        </w:drawing>
+      </w:r>
+    </w:p>
+    <w:p>
+      <w:pPr>
+        <w:ind w:left="708" w:hanging="708"/>
+        <w:rPr>
+          <w:lang w:val="es-ES"/>
+        </w:rPr>
+      </w:pPr>
+      <w:r>
+        <w:rPr>
+          <w:lang w:val="es-ES"/>
+        </w:rPr>
+        <w:t xml:space="preserve">Si se requiere </w:t>
+      </w:r>
+      <w:proofErr w:type="spellStart"/>
+      <w:r>
+        <w:rPr>
+          <w:lang w:val="es-ES"/>
+        </w:rPr>
+        <w:t>dmostrar</w:t>
+      </w:r>
+      <w:proofErr w:type="spellEnd"/>
+      <w:r>
+        <w:rPr>
+          <w:lang w:val="es-ES"/>
+        </w:rPr>
+        <w:t xml:space="preserve"> que asumiendo una formula tiene como </w:t>
+      </w:r>
+      <w:proofErr w:type="spellStart"/>
+      <w:r>
+        <w:rPr>
+          <w:lang w:val="es-ES"/>
+        </w:rPr>
+        <w:t>concencuencia</w:t>
+      </w:r>
+      <w:proofErr w:type="spellEnd"/>
+      <w:r>
+        <w:rPr>
+          <w:lang w:val="es-ES"/>
+        </w:rPr>
+        <w:t xml:space="preserve"> lógica otra</w:t>
+      </w:r>
+      <w:r>
+        <w:rPr>
+          <w:lang w:val="es-ES"/>
+        </w:rPr>
+        <w:t xml:space="preserve"> </w:t>
+      </w:r>
+      <w:r>
+        <w:rPr>
+          <w:lang w:val="es-ES"/>
+        </w:rPr>
+        <w:t xml:space="preserve">fórmula </w:t>
+      </w:r>
+    </w:p>
+    <w:p>
+      <w:pPr>
+        <w:ind w:left="1416" w:hanging="1416"/>
+        <w:rPr>
+          <w:lang w:val="es-ES"/>
+        </w:rPr>
+      </w:pPr>
       <w:bookmarkStart w:id="0" w:name="_GoBack"/>
       <w:bookmarkEnd w:id="0"/>
+    </w:p>
+    <w:p>
+      <w:pPr>
+        <w:ind w:left="708" w:hanging="708"/>
+        <w:rPr>
+          <w:lang w:val="es-ES"/>
+        </w:rPr>
+      </w:pPr>
+      <w:r>
+        <w:rPr>
+          <w:lang w:val="es-ES"/>
+        </w:rPr>
+        <w:t xml:space="preserve">Se empieza sumiendo algo y bajo esa suposición se demuestra </w:t>
+      </w:r>
+    </w:p>
+    <w:p>
+      <w:pPr>
+        <w:ind w:left="708" w:hanging="708"/>
+        <w:rPr>
+          <w:lang w:val="es-ES"/>
+        </w:rPr>
+      </w:pPr>
+      <w:r>
+        <w:rPr>
+          <w:lang w:val="es-ES"/>
+        </w:rPr>
+        <w:t xml:space="preserve">Nos interesa la estructura de la </w:t>
+      </w:r>
+      <w:proofErr w:type="spellStart"/>
+      <w:r>
+        <w:rPr>
+          <w:lang w:val="es-ES"/>
+        </w:rPr>
+        <w:t>demosyracion</w:t>
+      </w:r>
+      <w:proofErr w:type="spellEnd"/>
+      <w:r>
+        <w:rPr>
+          <w:lang w:val="es-ES"/>
+        </w:rPr>
+        <w:t xml:space="preserve"> </w:t>
+      </w:r>
+    </w:p>
+    <w:p>
+      <w:pPr>
+        <w:ind w:left="708" w:hanging="708"/>
+        <w:rPr>
+          <w:lang w:val="es-ES"/>
+        </w:rPr>
+      </w:pPr>
+      <w:r>
+        <w:rPr>
+          <w:lang w:val="es-ES"/>
+        </w:rPr>
+        <w:t>Conjunto de</w:t>
+      </w:r>
+      <w:r>
+        <w:rPr>
+          <w:lang w:val="es-ES"/>
+        </w:rPr>
+        <w:t xml:space="preserve"> potencia: conjunto de conjuntos</w:t>
+      </w:r>
+    </w:p>
+    <w:p>
+      <w:pPr>
+        <w:ind w:left="708" w:hanging="708"/>
+        <w:rPr>
+          <w:lang w:val="es-ES"/>
+        </w:rPr>
+      </w:pPr>
+      <w:proofErr w:type="spellStart"/>
+      <w:r>
+        <w:rPr>
+          <w:lang w:val="es-ES"/>
+        </w:rPr>
+        <w:t>Cant</w:t>
+      </w:r>
+      <w:proofErr w:type="spellEnd"/>
+      <w:r>
+        <w:rPr>
+          <w:lang w:val="es-ES"/>
+        </w:rPr>
+        <w:t xml:space="preserve"> de conjuntos de un conjunto de 3 canicas (verde, rojo y azul)</w:t>
+      </w:r>
+    </w:p>
+    <w:p>
+      <w:pPr>
+        <w:ind w:left="708" w:hanging="708"/>
+        <w:rPr>
+          <w:lang w:val="es-ES"/>
+        </w:rPr>
+      </w:pPr>
+      <w:r>
+        <w:rPr>
+          <w:lang w:val="es-ES"/>
+        </w:rPr>
+        <w:t>Conjunto vació es 1, el conjunto que contiene un solo elemento (8 subconjuntos)</w:t>
+      </w:r>
     </w:p>
     <w:sectPr>
       <w:pgSz w:w="12240" w:h="15840"/>
@@ -2014,6 +2476,29 @@
       <w:contextualSpacing/>
     </w:pPr>
   </w:style>
+  <w:style w:type="character" w:styleId="Hipervnculo">
+    <w:name w:val="Hyperlink"/>
+    <w:basedOn w:val="Fuentedeprrafopredeter"/>
+    <w:uiPriority w:val="99"/>
+    <w:unhideWhenUsed/>
+    <w:rsid w:val="00E728B4"/>
+    <w:rPr>
+      <w:color w:val="0563C1" w:themeColor="hyperlink"/>
+      <w:u w:val="single"/>
+    </w:rPr>
+  </w:style>
+  <w:style w:type="character" w:styleId="Mencinsinresolver">
+    <w:name w:val="Unresolved Mention"/>
+    <w:basedOn w:val="Fuentedeprrafopredeter"/>
+    <w:uiPriority w:val="99"/>
+    <w:semiHidden/>
+    <w:unhideWhenUsed/>
+    <w:rsid w:val="00E728B4"/>
+    <w:rPr>
+      <w:color w:val="605E5C"/>
+      <w:shd w:val="clear" w:color="auto" w:fill="E1DFDD"/>
+    </w:rPr>
+  </w:style>
 </w:styles>
 </file>
 

</xml_diff>

<commit_message>
P3 - mAR 28
</commit_message>
<xml_diff>
--- a/Paola Griselda/P3/IA_II_Notas Tercer Parcial 1.docx
+++ b/Paola Griselda/P3/IA_II_Notas Tercer Parcial 1.docx
@@ -1632,6 +1632,7 @@
       </w:pPr>
       <w:r>
         <w:rPr>
+          <w:noProof/>
           <w:lang w:val="es-ES"/>
         </w:rPr>
         <w:drawing>
@@ -1708,6 +1709,7 @@
       </w:pPr>
       <w:r>
         <w:rPr>
+          <w:noProof/>
           <w:lang w:val="es-ES"/>
         </w:rPr>
         <w:drawing>
@@ -1808,106 +1810,228 @@
           <w:lang w:val="es-ES"/>
         </w:rPr>
       </w:pPr>
+    </w:p>
+    <w:p>
+      <w:pPr>
+        <w:ind w:left="708" w:hanging="708"/>
+        <w:rPr>
+          <w:lang w:val="es-ES"/>
+        </w:rPr>
+      </w:pPr>
+      <w:r>
+        <w:rPr>
+          <w:lang w:val="es-ES"/>
+        </w:rPr>
+        <w:t xml:space="preserve">Se empieza sumiendo algo y bajo esa suposición se demuestra </w:t>
+      </w:r>
+    </w:p>
+    <w:p>
+      <w:pPr>
+        <w:ind w:left="708" w:hanging="708"/>
+        <w:rPr>
+          <w:lang w:val="es-ES"/>
+        </w:rPr>
+      </w:pPr>
+      <w:r>
+        <w:rPr>
+          <w:lang w:val="es-ES"/>
+        </w:rPr>
+        <w:t xml:space="preserve">Nos interesa la estructura de la </w:t>
+      </w:r>
+      <w:proofErr w:type="spellStart"/>
+      <w:r>
+        <w:rPr>
+          <w:lang w:val="es-ES"/>
+        </w:rPr>
+        <w:t>demosyracion</w:t>
+      </w:r>
+      <w:proofErr w:type="spellEnd"/>
+      <w:r>
+        <w:rPr>
+          <w:lang w:val="es-ES"/>
+        </w:rPr>
+        <w:t xml:space="preserve"> </w:t>
+      </w:r>
+    </w:p>
+    <w:p>
+      <w:pPr>
+        <w:ind w:left="708" w:hanging="708"/>
+        <w:rPr>
+          <w:lang w:val="es-ES"/>
+        </w:rPr>
+      </w:pPr>
+      <w:r>
+        <w:rPr>
+          <w:lang w:val="es-ES"/>
+        </w:rPr>
+        <w:t>Conjunto de</w:t>
+      </w:r>
+      <w:r>
+        <w:rPr>
+          <w:lang w:val="es-ES"/>
+        </w:rPr>
+        <w:t xml:space="preserve"> potencia: conjunto de conjuntos</w:t>
+      </w:r>
+    </w:p>
+    <w:p>
+      <w:pPr>
+        <w:ind w:left="708" w:hanging="708"/>
+        <w:rPr>
+          <w:lang w:val="es-ES"/>
+        </w:rPr>
+      </w:pPr>
+      <w:proofErr w:type="spellStart"/>
+      <w:r>
+        <w:rPr>
+          <w:lang w:val="es-ES"/>
+        </w:rPr>
+        <w:t>Cant</w:t>
+      </w:r>
+      <w:proofErr w:type="spellEnd"/>
+      <w:r>
+        <w:rPr>
+          <w:lang w:val="es-ES"/>
+        </w:rPr>
+        <w:t xml:space="preserve"> de conjuntos de un conjunto de 3 canicas (verde, rojo y azul)</w:t>
+      </w:r>
+    </w:p>
+    <w:p>
+      <w:pPr>
+        <w:ind w:left="708" w:hanging="708"/>
+        <w:rPr>
+          <w:lang w:val="es-ES"/>
+        </w:rPr>
+      </w:pPr>
+      <w:r>
+        <w:rPr>
+          <w:lang w:val="es-ES"/>
+        </w:rPr>
+        <w:t>Conjunto vació es 1, el conjunto que contiene un solo elemento (8 subconjuntos)</w:t>
+      </w:r>
+    </w:p>
+    <w:p>
+      <w:pPr>
+        <w:ind w:left="708" w:hanging="708"/>
+        <w:rPr>
+          <w:lang w:val="es-ES"/>
+        </w:rPr>
+      </w:pPr>
+    </w:p>
+    <w:p>
+      <w:pPr>
+        <w:ind w:left="708" w:hanging="708"/>
+        <w:rPr>
+          <w:lang w:val="es-ES"/>
+        </w:rPr>
+      </w:pPr>
+      <w:r>
+        <w:rPr>
+          <w:lang w:val="es-ES"/>
+        </w:rPr>
+        <w:t xml:space="preserve">Martes </w:t>
+      </w:r>
+    </w:p>
+    <w:p>
+      <w:pPr>
+        <w:ind w:left="708" w:hanging="708"/>
+        <w:rPr>
+          <w:lang w:val="es-ES"/>
+        </w:rPr>
+      </w:pPr>
+      <w:r>
+        <w:rPr>
+          <w:lang w:val="es-ES"/>
+        </w:rPr>
+        <w:t xml:space="preserve">Si se </w:t>
+      </w:r>
+      <w:proofErr w:type="spellStart"/>
+      <w:r>
+        <w:rPr>
+          <w:lang w:val="es-ES"/>
+        </w:rPr>
+        <w:t>se</w:t>
+      </w:r>
+      <w:proofErr w:type="spellEnd"/>
+      <w:r>
+        <w:rPr>
+          <w:lang w:val="es-ES"/>
+        </w:rPr>
+        <w:t xml:space="preserve"> aplica el “– “ </w:t>
+      </w:r>
+    </w:p>
+    <w:p>
+      <w:pPr>
+        <w:ind w:left="708" w:hanging="708"/>
+        <w:rPr>
+          <w:lang w:val="es-ES"/>
+        </w:rPr>
+      </w:pPr>
+      <w:r>
+        <w:rPr>
+          <w:lang w:val="es-ES"/>
+        </w:rPr>
+        <w:t>S</w:t>
+      </w:r>
+    </w:p>
+    <w:p>
+      <w:pPr>
+        <w:ind w:left="708" w:hanging="708"/>
+        <w:rPr>
+          <w:lang w:val="es-ES"/>
+        </w:rPr>
+      </w:pPr>
+    </w:p>
+    <w:p>
+      <w:pPr>
+        <w:ind w:left="708" w:hanging="708"/>
+        <w:rPr>
+          <w:lang w:val="es-ES"/>
+        </w:rPr>
+      </w:pPr>
+      <w:proofErr w:type="spellStart"/>
+      <w:r>
+        <w:rPr>
+          <w:lang w:val="es-ES"/>
+        </w:rPr>
+        <w:t>Sustitur</w:t>
+      </w:r>
+      <w:proofErr w:type="spellEnd"/>
+      <w:r>
+        <w:rPr>
+          <w:lang w:val="es-ES"/>
+        </w:rPr>
+        <w:t xml:space="preserve"> los </w:t>
+      </w:r>
+      <w:proofErr w:type="spellStart"/>
+      <w:r>
+        <w:rPr>
+          <w:lang w:val="es-ES"/>
+        </w:rPr>
+        <w:t>sorry</w:t>
+      </w:r>
+      <w:proofErr w:type="spellEnd"/>
+      <w:r>
+        <w:rPr>
+          <w:lang w:val="es-ES"/>
+        </w:rPr>
+        <w:t xml:space="preserve"> por una demostración ya que </w:t>
+      </w:r>
+      <w:proofErr w:type="spellStart"/>
+      <w:r>
+        <w:rPr>
+          <w:lang w:val="es-ES"/>
+        </w:rPr>
+        <w:t>sorry</w:t>
+      </w:r>
+      <w:proofErr w:type="spellEnd"/>
+      <w:r>
+        <w:rPr>
+          <w:lang w:val="es-ES"/>
+        </w:rPr>
+        <w:t xml:space="preserve"> siempre va a demostrar que t</w:t>
+      </w:r>
       <w:bookmarkStart w:id="0" w:name="_GoBack"/>
       <w:bookmarkEnd w:id="0"/>
-    </w:p>
-    <w:p>
-      <w:pPr>
-        <w:ind w:left="708" w:hanging="708"/>
-        <w:rPr>
-          <w:lang w:val="es-ES"/>
-        </w:rPr>
-      </w:pPr>
-      <w:r>
-        <w:rPr>
-          <w:lang w:val="es-ES"/>
-        </w:rPr>
-        <w:t xml:space="preserve">Se empieza sumiendo algo y bajo esa suposición se demuestra </w:t>
-      </w:r>
-    </w:p>
-    <w:p>
-      <w:pPr>
-        <w:ind w:left="708" w:hanging="708"/>
-        <w:rPr>
-          <w:lang w:val="es-ES"/>
-        </w:rPr>
-      </w:pPr>
-      <w:r>
-        <w:rPr>
-          <w:lang w:val="es-ES"/>
-        </w:rPr>
-        <w:t xml:space="preserve">Nos interesa la estructura de la </w:t>
-      </w:r>
-      <w:proofErr w:type="spellStart"/>
-      <w:r>
-        <w:rPr>
-          <w:lang w:val="es-ES"/>
-        </w:rPr>
-        <w:t>demosyracion</w:t>
-      </w:r>
-      <w:proofErr w:type="spellEnd"/>
-      <w:r>
-        <w:rPr>
-          <w:lang w:val="es-ES"/>
-        </w:rPr>
-        <w:t xml:space="preserve"> </w:t>
-      </w:r>
-    </w:p>
-    <w:p>
-      <w:pPr>
-        <w:ind w:left="708" w:hanging="708"/>
-        <w:rPr>
-          <w:lang w:val="es-ES"/>
-        </w:rPr>
-      </w:pPr>
-      <w:r>
-        <w:rPr>
-          <w:lang w:val="es-ES"/>
-        </w:rPr>
-        <w:t>Conjunto de</w:t>
-      </w:r>
-      <w:r>
-        <w:rPr>
-          <w:lang w:val="es-ES"/>
-        </w:rPr>
-        <w:t xml:space="preserve"> potencia: conjunto de conjuntos</w:t>
-      </w:r>
-    </w:p>
-    <w:p>
-      <w:pPr>
-        <w:ind w:left="708" w:hanging="708"/>
-        <w:rPr>
-          <w:lang w:val="es-ES"/>
-        </w:rPr>
-      </w:pPr>
-      <w:proofErr w:type="spellStart"/>
-      <w:r>
-        <w:rPr>
-          <w:lang w:val="es-ES"/>
-        </w:rPr>
-        <w:t>Cant</w:t>
-      </w:r>
-      <w:proofErr w:type="spellEnd"/>
-      <w:r>
-        <w:rPr>
-          <w:lang w:val="es-ES"/>
-        </w:rPr>
-        <w:t xml:space="preserve"> de conjuntos de un conjunto de 3 canicas (verde, rojo y azul)</w:t>
-      </w:r>
-    </w:p>
-    <w:p>
-      <w:pPr>
-        <w:ind w:left="708" w:hanging="708"/>
-        <w:rPr>
-          <w:lang w:val="es-ES"/>
-        </w:rPr>
-      </w:pPr>
-      <w:r>
-        <w:rPr>
-          <w:lang w:val="es-ES"/>
-        </w:rPr>
-        <w:t>Conjunto vació es 1, el conjunto que contiene un solo elemento (8 subconjuntos)</w:t>
-      </w:r>
     </w:p>
     <w:sectPr>
       <w:pgSz w:w="12240" w:h="15840"/>

</xml_diff>